<commit_message>
Agregar editor inline del borrador del acta
Nueva página EditActaInlinePage con edición en línea de los campos del acta
(spans contenteditable resaltados por origen del dato), persistiendo en el
template_data del borrador sin recompilar. Ajusta GenerateActaDocxService y la
plantilla de render.

Co-Authored-By: Claude Opus 4.8 <noreply@anthropic.com>
</commit_message>
<xml_diff>
--- a/storage/docs/sa.docx
+++ b/storage/docs/sa.docx
@@ -6502,29 +6502,75 @@
       </w:r>
     </w:p>
     <w:p>
-      <w:pPr>
-        <w:widowControl/>
-        <w:ind w:firstLine="0"/>
-        <w:jc w:val="both"/>
-        <w:rPr>
-          <w:rFonts w:ascii="Times New Roman" w:eastAsia="Times New Roman" w:hAnsi="Times New Roman" w:cs="Times New Roman"/>
-          <w:b/>
-          <w:bCs/>
-          <w:lang w:val="es-MX"/>
-        </w:rPr>
-      </w:pPr>
-    </w:p>
-    <w:p>
-      <w:pPr>
-        <w:widowControl/>
-        <w:ind w:firstLine="0"/>
-        <w:rPr>
-          <w:rFonts w:ascii="Times New Roman" w:eastAsia="Times New Roman" w:hAnsi="Times New Roman" w:cs="Times New Roman"/>
-          <w:lang w:val="es-MX"/>
-        </w:rPr>
-      </w:pPr>
-    </w:p>
-    <w:p/>
+      <w:pPr/>
+      <w:r>
+        <w:br w:type="page"/>
+      </w:r>
+    </w:p>
+    <w:p>
+      <w:pPr/>
+      <w:r>
+        <w:t>------------------------------F I R M A S------------------------------</w:t>
+      </w:r>
+    </w:p>
+    <w:p>
+      <w:pPr/>
+      <w:r/>
+    </w:p>
+    <w:p>
+      <w:pPr/>
+      <w:r>
+        <w:t>${signaturePage}</w:t>
+      </w:r>
+    </w:p>
+    <w:p>
+      <w:pPr/>
+      <w:r/>
+    </w:p>
+    <w:p>
+      <w:pPr/>
+      <w:r>
+        <w:t>______________________________________</w:t>
+      </w:r>
+    </w:p>
+    <w:p>
+      <w:pPr/>
+      <w:r>
+        <w:t>-${socio_anchor}</w:t>
+      </w:r>
+    </w:p>
+    <w:p>
+      <w:pPr/>
+      <w:r/>
+    </w:p>
+    <w:p>
+      <w:pPr/>
+      <w:r>
+        <w:t>Nombre: ${socio_nombre}</w:t>
+      </w:r>
+    </w:p>
+    <w:p>
+      <w:pPr/>
+      <w:r>
+        <w:t>RFC: ${socio_rfc}</w:t>
+      </w:r>
+    </w:p>
+    <w:p>
+      <w:pPr/>
+      <w:r>
+        <w:t>Acciones suscritas: ${socio_acciones}</w:t>
+      </w:r>
+    </w:p>
+    <w:p>
+      <w:pPr/>
+      <w:r/>
+    </w:p>
+    <w:p>
+      <w:pPr/>
+      <w:r>
+        <w:t>${/signaturePage}</w:t>
+      </w:r>
+    </w:p>
     <w:sectPr>
       <w:headerReference w:type="even" r:id="rId6"/>
       <w:headerReference w:type="default" r:id="rId7"/>

</xml_diff>